<commit_message>
Roman reels: dash-free HeyGen texts (pauses via punctuation)
Co-Authored-By: Claude Opus 5.5 <noreply@anthropic.com>
Claude-Session: https://claude.ai/code/session_012XK78gBCYLJFULW6X1fJk1
</commit_message>
<xml_diff>
--- a/roman-reels/docs/Roman-scenarii-ManyChat-i-Claude.docx
+++ b/roman-reels/docs/Roman-scenarii-ManyChat-i-Claude.docx
@@ -50,7 +50,7 @@
           <w:b w:val="0"/>
           <w:i w:val="0"/>
         </w:rPr>
-        <w:t>Хук 1: Хочешь фокус? Напиши под этим видео слово «БОТ» — и через пару секунд тебе в директ придёт сообщение. Сейчас покажу, как это устроено.</w:t>
+        <w:t>Хук 1: Хочешь фокус? Напиши под этим видео слово «БОТ». И через пару секунд тебе в директ придёт сообщение. Сейчас покажу, как это устроено.</w:t>
       </w:r>
     </w:p>
     <w:p>
@@ -59,7 +59,7 @@
           <w:b w:val="0"/>
           <w:i w:val="0"/>
         </w:rPr>
-        <w:t>Хук 2: Видел, как блогеры пишут: «Напиши слово в комментариях — пришлю гайд»? Это не они сидят и отвечают каждому. Показываю, как настроить так же.</w:t>
+        <w:t>Хук 2: Видел, как блогеры пишут: «Напиши слово в комментариях, и я пришлю гайд»? Это не они сидят и отвечают каждому. Показываю, как настроить так же.</w:t>
       </w:r>
     </w:p>
     <w:p>
@@ -85,7 +85,7 @@
           <w:b w:val="0"/>
           <w:i w:val="0"/>
         </w:rPr>
-        <w:t>Это ManyChat — сервис, который отвечает в директ за тебя. Схема простая: человек пишет кодовое слово под рилсом — и сразу получает в директ ссылку, гайд или прайс. Тебе не нужно отвечать каждому вручную.</w:t>
+        <w:t>Это ManyChat. Сервис, который отвечает в директ за тебя. Схема простая: человек пишет кодовое слово под рилсом. И сразу получает в директ ссылку, гайд или прайс. Тебе не нужно отвечать каждому вручную.</w:t>
       </w:r>
     </w:p>
     <w:p>
@@ -94,7 +94,7 @@
           <w:b w:val="0"/>
           <w:i w:val="0"/>
         </w:rPr>
-        <w:t>Как настроить. Первое: переведи Instagram в профессиональный аккаунт — бизнес или автор. Второе: зарегистрируйся в ManyChat и подключи Instagram через официальный вход Meta — пароль никому передавать не нужно. Третье: создай автоматизацию из шаблона ответа на комментарий, выбери рилс и кодовое слово. Четвёртое: напиши публичный ответ под комментарием и само сообщение в директ — со ссылкой или кнопкой. Включи и проверь со второго аккаунта.</w:t>
+        <w:t>Как настроить. Первое: переведи Instagram в профессиональный аккаунт, бизнес или автор. Второе: зарегистрируйся в ManyChat и подключи Instagram через официальный вход Meta. Пароль никому передавать не нужно. Третье: создай автоматизацию из шаблона ответа на комментарий, выбери рилс и кодовое слово. Четвёртое: напиши публичный ответ под комментарием и само сообщение в директ, со ссылкой или кнопкой. Включи и проверь со второго аккаунта.</w:t>
       </w:r>
     </w:p>
     <w:p>
@@ -103,7 +103,7 @@
           <w:b w:val="0"/>
           <w:i w:val="0"/>
         </w:rPr>
-        <w:t>И важно: человек получает то, что ты обещал, сразу, пока ему интересно, — а не через три часа, когда ты увидишь комментарий. А в ManyChat остаётся список всех, кто написал.</w:t>
+        <w:t>И важно: человек получает то, что ты обещал, сразу, пока ему интересно. А не через три часа, когда ты увидишь комментарий. А в ManyChat остаётся список всех, кто написал.</w:t>
       </w:r>
     </w:p>
     <w:p>
@@ -112,7 +112,7 @@
           <w:b w:val="0"/>
           <w:i w:val="0"/>
         </w:rPr>
-        <w:t>Совет: кодовое слово — одно и короткое, например «ПРАЙС». А в директ — сразу польза, без «спасибо за интерес, скоро свяжемся».</w:t>
+        <w:t>Совет: кодовое слово должно быть одно и короткое, например «ПРАЙС». А в директ сразу давай пользу, без «спасибо за интерес, скоро свяжемся».</w:t>
       </w:r>
     </w:p>
     <w:p>
@@ -121,7 +121,7 @@
           <w:b w:val="0"/>
           <w:i w:val="0"/>
         </w:rPr>
-        <w:t>А дальше к ManyChat можно подключить нейросеть, которая продолжит диалог, — но это уже платная функция, и о ней будет следующее видео.</w:t>
+        <w:t>А дальше к ManyChat можно подключить нейросеть, которая продолжит диалог. Но это уже платная функция, и о ней будет следующее видео.</w:t>
       </w:r>
     </w:p>
     <w:p>
@@ -130,7 +130,7 @@
           <w:b w:val="0"/>
           <w:i w:val="0"/>
         </w:rPr>
-        <w:t>Напиши в комментариях «БОТ» — и тебе в директ придёт пошаговая инструкция по этой настройке.</w:t>
+        <w:t>Напиши в комментариях «БОТ», и тебе в директ придёт пошаговая инструкция по этой настройке.</w:t>
       </w:r>
     </w:p>
     <w:p>
@@ -254,7 +254,7 @@
           <w:b w:val="0"/>
           <w:i w:val="0"/>
         </w:rPr>
-        <w:t>Хук 1: Anthropic раздаёт Claude бесплатно на год. Но получат не все — разбираю, кто проходит.</w:t>
+        <w:t>Хук 1: Anthropic раздаёт Claude бесплатно на год. Но получат не все. Разбираю, кто проходит.</w:t>
       </w:r>
     </w:p>
     <w:p>
@@ -263,7 +263,7 @@
           <w:b w:val="0"/>
           <w:i w:val="0"/>
         </w:rPr>
-        <w:t>Хук 2: Год платного Claude для команды из пяти человек — бесплатно. Вот как подать заявку.</w:t>
+        <w:t>Хук 2: Год платного Claude для команды из пяти человек. Бесплатно! Вот как подать заявку.</w:t>
       </w:r>
     </w:p>
     <w:p>
@@ -272,7 +272,7 @@
           <w:b w:val="0"/>
           <w:i w:val="0"/>
         </w:rPr>
-        <w:t>Хук 3: Если у тебя свой продукт, можно получить Claude бесплатно на год. Главное — не совершить ошибку, из-за которой отказывают.</w:t>
+        <w:t>Хук 3: Если у тебя свой продукт, можно получить Claude бесплатно на год. Главное, не соверши ошибку, из-за которой отказывают.</w:t>
       </w:r>
     </w:p>
     <w:p>
@@ -289,7 +289,7 @@
           <w:b w:val="0"/>
           <w:i w:val="0"/>
         </w:rPr>
-        <w:t>Шестого октября Anthropic обновили программу для стартапов. Что дают: год тарифа Claude Team — до пяти премиум-мест, тысячу долларов на API и скидки партнёров до сорока пяти тысяч долларов. Плюс консультации с инженерами Anthropic.</w:t>
+        <w:t>Шестого октября Anthropic обновили программу для стартапов. Что дают: год тарифа Claude Team, до пяти премиум-мест. Тысячу долларов на API. И скидки партнёров до сорока пяти тысяч долларов. Плюс консультации с инженерами Anthropic.</w:t>
       </w:r>
     </w:p>
     <w:p>
@@ -298,7 +298,7 @@
           <w:b w:val="0"/>
           <w:i w:val="0"/>
         </w:rPr>
-        <w:t>Кто может подать: стартап, которому меньше пяти лет, или проект, который получал инвестиции за последние два года. И инвестиции не обязательны — подходят проекты на свои деньги.</w:t>
+        <w:t>Кто может подать: стартап, которому меньше пяти лет. Или проект, который получал инвестиции за последние два года. И инвестиции не обязательны: подходят проекты на свои деньги.</w:t>
       </w:r>
     </w:p>
     <w:p>
@@ -307,7 +307,7 @@
           <w:b w:val="0"/>
           <w:i w:val="0"/>
         </w:rPr>
-        <w:t>Что нужно: аккаунт в Claude Console, почта на домене твоего сайта — не Gmail — и короткое описание продукта. Решение часто приходит за минуты, остальные заявки смотрят два-три рабочих дня.</w:t>
+        <w:t>Что нужно: аккаунт в Claude Console, почта на домене твоего сайта, не Gmail, и короткое описание продукта. Решение часто приходит за минуты. Остальные заявки смотрят два-три рабочих дня.</w:t>
       </w:r>
     </w:p>
     <w:p>
@@ -316,7 +316,7 @@
           <w:b w:val="0"/>
           <w:i w:val="0"/>
         </w:rPr>
-        <w:t>А теперь то, о чём часто молчат. Программа работает только в странах, где Claude официально доступен. Например, Казахстан и Грузия подходят, а Россия и Беларусь — нет. Полный список есть на сайте Anthropic. Обходить это не советую: аккаунт могут заблокировать вместе с подпиской.</w:t>
+        <w:t>А теперь то, о чём часто молчат. Программа работает только в странах, где Claude официально доступен. Например, Казахстан и Грузия подходят. А Россия и Беларусь нет. Полный список есть на сайте Anthropic. Обходить это не советую: аккаунт могут заблокировать вместе с подпиской.</w:t>
       </w:r>
     </w:p>
     <w:p>
@@ -325,7 +325,7 @@
           <w:b w:val="0"/>
           <w:i w:val="0"/>
         </w:rPr>
-        <w:t>И два нюанса. Кредиты на API сгорают через шесть месяцев, и работают они только через Claude Console — не через AWS и не через Google Cloud. А если в тебя вложился венчурный фонд из партнёрской сети Anthropic, можно получить ещё до ста тысяч долларов на API.</w:t>
+        <w:t>И два нюанса. Кредиты на API сгорают через шесть месяцев. И работают они только через Claude Console, не через AWS и не через Google Cloud. А если в тебя вложился венчурный фонд из партнёрской сети Anthropic, можно получить ещё до ста тысяч долларов на API.</w:t>
       </w:r>
     </w:p>
     <w:p>
@@ -334,7 +334,7 @@
           <w:b w:val="0"/>
           <w:i w:val="0"/>
         </w:rPr>
-        <w:t>Напиши в комментариях, какой у тебя продукт, — и в следующем видео я разберу, как описать его в заявке.</w:t>
+        <w:t>Напиши в комментариях, какой у тебя продукт. И в следующем видео я разберу, как описать его в заявке.</w:t>
       </w:r>
     </w:p>
     <w:p>
@@ -416,7 +416,7 @@
           <w:i/>
           <w:color w:val="6E6E6E"/>
         </w:rPr>
-        <w:t>Вставлять как есть: английские слова записаны так, как их правильно прочитает озвучка.</w:t>
+        <w:t>Вставлять как есть: английские слова записаны так, как их правильно прочитает озвучка. Без тире: HeyGen их не читает как паузу, поэтому паузы сделаны точками и запятыми.</w:t>
       </w:r>
     </w:p>
     <w:p>
@@ -442,7 +442,7 @@
           <w:b w:val="0"/>
           <w:i w:val="0"/>
         </w:rPr>
-        <w:t>Хочешь фокус? Напиши под этим видео слово «БОТ» — и через пару секунд тебе в директ придёт сообщение. Сейчас покажу, как это устроено.</w:t>
+        <w:t>Хочешь фокус? Напиши под этим видео слово «БОТ». И через пару секунд тебе в директ придёт сообщение. Сейчас покажу, как это устроено.</w:t>
       </w:r>
     </w:p>
     <w:p>
@@ -460,7 +460,7 @@
           <w:b w:val="0"/>
           <w:i w:val="0"/>
         </w:rPr>
-        <w:t>Видел, как блогеры пишут: «Напиши слово в комментариях — пришлю гайд»? Это не они сидят и отвечают каждому. Показываю, как настроить так же.</w:t>
+        <w:t>Видел, как блогеры пишут: «Напиши слово в комментариях, и я пришлю гайд»? Это не они сидят и отвечают каждому. Показываю, как настроить так же.</w:t>
       </w:r>
     </w:p>
     <w:p>
@@ -496,7 +496,7 @@
           <w:b w:val="0"/>
           <w:i w:val="0"/>
         </w:rPr>
-        <w:t>Это МэниЧат — сервис, который отвечает в директ за тебя. Схема простая: человек пишет кодовое слово под рилсом — и сразу получает в директ ссылку, гайд или прайс. Тебе не нужно отвечать каждому вручную. Как настроить. Первое: переведи Инстаграм в профессиональный аккаунт — бизнес или автор. Второе: зарегистрируйся в МэниЧат и подключи Инстаграм через официальный вход Мета — пароль никому передавать не нужно. Третье: создай автоматизацию из шаблона ответа на комментарий, выбери рилс и кодовое слово. Четвёртое: напиши публичный ответ под комментарием и само сообщение в директ — со ссылкой или кнопкой. Включи и проверь со второго аккаунта. И важно: человек получает то, что ты обещал, сразу, пока ему интересно, — а не через три часа, когда ты увидишь комментарий. А в МэниЧат остаётся список всех, кто написал. Совет: кодовое слово — одно и короткое, например «ПРАЙС». А в директ — сразу польза, без «спасибо за интерес, скоро свяжемся». А дальше к МэниЧат можно подключить нейросеть, которая продолжит диалог, — но это уже платная функция, и о ней будет следующее видео. Напиши в комментариях «БОТ» — и тебе в директ придёт пошаговая инструкция по этой настройке.</w:t>
+        <w:t>Это МэниЧат. Сервис, который отвечает в директ за тебя. Схема простая: человек пишет кодовое слово под рилсом. И сразу получает в директ ссылку, гайд или прайс. Тебе не нужно отвечать каждому вручную. Как настроить. Первое: переведи Инстаграм в профессиональный аккаунт, бизнес или автор. Второе: зарегистрируйся в МэниЧат и подключи Инстаграм через официальный вход Мета. Пароль никому передавать не нужно. Третье: создай автоматизацию из шаблона ответа на комментарий, выбери рилс и кодовое слово. Четвёртое: напиши публичный ответ под комментарием и само сообщение в директ, со ссылкой или кнопкой. Включи и проверь со второго аккаунта. И важно: человек получает то, что ты обещал, сразу, пока ему интересно. А не через три часа, когда ты увидишь комментарий. А в МэниЧат остаётся список всех, кто написал. Совет: кодовое слово должно быть одно и короткое, например «ПРАЙС». А в директ сразу давай пользу, без «спасибо за интерес, скоро свяжемся». А дальше к МэниЧат можно подключить нейросеть, которая продолжит диалог. Но это уже платная функция, и о ней будет следующее видео. Напиши в комментариях «БОТ», и тебе в директ придёт пошаговая инструкция по этой настройке.</w:t>
       </w:r>
     </w:p>
     <w:p>
@@ -522,7 +522,7 @@
           <w:b w:val="0"/>
           <w:i w:val="0"/>
         </w:rPr>
-        <w:t>Антропик раздаёт Клод бесплатно на год. Но получат не все — разбираю, кто проходит.</w:t>
+        <w:t>Антропик раздаёт Клод бесплатно на год. Но получат не все. Разбираю, кто проходит.</w:t>
       </w:r>
     </w:p>
     <w:p>
@@ -540,7 +540,7 @@
           <w:b w:val="0"/>
           <w:i w:val="0"/>
         </w:rPr>
-        <w:t>Год платного Клод для команды из пяти человек — бесплатно. Вот как подать заявку.</w:t>
+        <w:t>Год платного Клода для команды из пяти человек. Бесплатно! Вот как подать заявку.</w:t>
       </w:r>
     </w:p>
     <w:p>
@@ -558,7 +558,7 @@
           <w:b w:val="0"/>
           <w:i w:val="0"/>
         </w:rPr>
-        <w:t>Если у тебя свой продукт, можно получить Клод бесплатно на год. Главное — не совершить ошибку, из-за которой отказывают.</w:t>
+        <w:t>Если у тебя свой продукт, можно получить Клод бесплатно на год. Главное, не соверши ошибку, из-за которой отказывают.</w:t>
       </w:r>
     </w:p>
     <w:p>
@@ -576,7 +576,7 @@
           <w:b w:val="0"/>
           <w:i w:val="0"/>
         </w:rPr>
-        <w:t>Шестого октября Антропик обновили программу для стартапов. Что дают: год тарифа Клод Тим — до пяти премиум-мест, тысячу долларов на эй-пи-ай и скидки партнёров до сорока пяти тысяч долларов. Плюс консультации с инженерами Антропик. Кто может подать: стартап, которому меньше пяти лет, или проект, который получал инвестиции за последние два года. И инвестиции не обязательны — подходят проекты на свои деньги. Что нужно: аккаунт в Клод Консоль, почта на домене твоего сайта — не Gmail — и короткое описание продукта. Решение часто приходит за минуты, остальные заявки смотрят два-три рабочих дня. А теперь то, о чём часто молчат. Программа работает только в странах, где Клод официально доступен. Например, Казахстан и Грузия подходят, а Россия и Беларусь — нет. Полный список есть на сайте Антропик. Обходить это не советую: аккаунт могут заблокировать вместе с подпиской. И два нюанса. Кредиты на эй-пи-ай сгорают через шесть месяцев, и работают они только через Клод Консоль — не через эй-дабл-ю-эс и не через Гугл Клауд. А если в тебя вложился венчурный фонд из партнёрской сети Антропик, можно получить ещё до ста тысяч долларов на эй-пи-ай. Напиши в комментариях, какой у тебя продукт, — и в следующем видео я разберу, как описать его в заявке.</w:t>
+        <w:t>Шестого октября Антропик обновили программу для стартапов. Что дают: год тарифа Клод Тим, до пяти премиум-мест. Тысячу долларов на эй-пи-ай. И скидки партнёров до сорока пяти тысяч долларов. Плюс консультации с инженерами Антропик. Кто может подать: стартап, которому меньше пяти лет. Или проект, который получал инвестиции за последние два года. И инвестиции не обязательны: подходят проекты на свои деньги. Что нужно: аккаунт в Клод Консоль, почта на домене твоего сайта, не джимейл, и короткое описание продукта. Решение часто приходит за минуты. Остальные заявки смотрят два-три рабочих дня. А теперь то, о чём часто молчат. Программа работает только в странах, где Клод официально доступен. Например, Казахстан и Грузия подходят. А Россия и Беларусь нет. Полный список есть на сайте Антропик. Обходить это не советую: аккаунт могут заблокировать вместе с подпиской. И два нюанса. Кредиты на эй-пи-ай сгорают через шесть месяцев. И работают они только через Клод Консоль, не через эй-дабл-ю-эс и не через Гугл Клауд. А если в тебя вложился венчурный фонд из партнёрской сети Антропик, можно получить ещё до ста тысяч долларов на эй-пи-ай. Напиши в комментариях, какой у тебя продукт. И в следующем видео я разберу, как описать его в заявке.</w:t>
       </w:r>
     </w:p>
     <w:sectPr>

</xml_diff>